<commit_message>
Fix DOI duplication in supplementary index DOCX
- Supplementary Index: DOI URL was repeated 5 times due to conversion artifact
- Split concatenated repository info lines into separate paragraphs
- DOI now appears correctly: identifier + URL link only

Co-Authored-By: Claude <noreply@anthropic.com>
</commit_message>
<xml_diff>
--- a/UPLOAD_THIS_ESMO_OPEN_V3_10_HARDENED_UNDER20/ESMO_OPEN_SUPPLEMENTARY_INDEX_CORE_V3_10.docx
+++ b/UPLOAD_THIS_ESMO_OPEN_V3_10_HARDENED_UNDER20/ESMO_OPEN_SUPPLEMENTARY_INDEX_CORE_V3_10.docx
@@ -281,7 +281,23 @@
         <w:pStyle w:val="BodyText"/>
       </w:pPr>
       <w:r>
-        <w:t>Public repository URL (repository root): https://github.com/xutaoguo55/ici-irae-phenotype-decomposition-esmo-open-v3-10 Submission-facing package (v3.10): https://github.com/xutaoguo55/ici-irae-phenotype-decomposition-esmo-open-v3-10/releases/tag/v3.10 DOI: 10.5281/zenodo.20989857 (https://doi.org/10.5281/zenodo.20989857). (https://doi.org/10.5281/zenodo.20989857). (https://doi.org/10.5281/zenodo.20989857). (https://doi.org/10.5281/zenodo.20989857). (https://doi.org/10.5281/zenodo.20989857).</w:t>
+        <w:t>Public repository URL (repository root): https://github.com/xutaoguo55/ici-irae-phenotype-decomposition-esmo-open-v3-10</w:t>
+      </w:r>
+    </w:p>
+    <w:p>
+      <w:pPr>
+        <w:pStyle w:val="BodyText"/>
+      </w:pPr>
+      <w:r>
+        <w:t xml:space="preserve">Submission-facing package (v3.10): https://github.com/xutaoguo55/ici-irae-phenotype-decomposition-esmo-open-v3-10/releases/tag/v3.10</w:t>
+      </w:r>
+    </w:p>
+    <w:p>
+      <w:pPr>
+        <w:pStyle w:val="BodyText"/>
+      </w:pPr>
+      <w:r>
+        <w:t xml:space="preserve">DOI: 10.5281/zenodo.20989857 (https://doi.org/10.5281/zenodo.20989857).</w:t>
       </w:r>
     </w:p>
     <w:bookmarkEnd w:id="12"/>

</xml_diff>

<commit_message>
v3.10 audit A1-A9+B1-B7: complete package
</commit_message>
<xml_diff>
--- a/UPLOAD_THIS_ESMO_OPEN_V3_10_HARDENED_UNDER20/ESMO_OPEN_SUPPLEMENTARY_INDEX_CORE_V3_10.docx
+++ b/UPLOAD_THIS_ESMO_OPEN_V3_10_HARDENED_UNDER20/ESMO_OPEN_SUPPLEMENTARY_INDEX_CORE_V3_10.docx
@@ -8,7 +8,7 @@
         <w:pStyle w:val="Heading1"/>
       </w:pPr>
       <w:r>
-        <w:t xml:space="preserve">ESMO Open Core Supplementary / Repository Index v3.10</w:t>
+        <w:t>ESMO Open Core Supplementary / Repository Index v3.10</w:t>
       </w:r>
     </w:p>
     <w:p>
@@ -16,7 +16,7 @@
         <w:pStyle w:val="FirstParagraph"/>
       </w:pPr>
       <w:r>
-        <w:t xml:space="preserve">This index lists the journal-facing core files for the v3.10 hardened package. It intentionally excludes internal development drafts and QC clutter.</w:t>
+        <w:t>This index lists the journal-facing core files for the v3.10 hardened package. It intentionally excludes internal development drafts and QC clutter.</w:t>
       </w:r>
     </w:p>
     <w:bookmarkStart w:id="9" w:name="manuscript-and-cover"/>
@@ -25,7 +25,7 @@
         <w:pStyle w:val="Heading2"/>
       </w:pPr>
       <w:r>
-        <w:t xml:space="preserve">Manuscript and Cover</w:t>
+        <w:t>Manuscript and Cover</w:t>
       </w:r>
     </w:p>
     <w:p>
@@ -40,7 +40,7 @@
         <w:rPr>
           <w:rStyle w:val="VerbatimChar"/>
         </w:rPr>
-        <w:t xml:space="preserve">ICI_IRAE_TOXICITY_PHENOTYPE_DECOMPOSITION_V3_10_ESMO_OPEN_HARDENED.docx</w:t>
+        <w:t>ICI_IRAE_TOXICITY_PHENOTYPE_DECOMPOSITION_V3_10_ESMO_OPEN_HARDENED.docx</w:t>
       </w:r>
     </w:p>
     <w:p>
@@ -55,7 +55,7 @@
         <w:rPr>
           <w:rStyle w:val="VerbatimChar"/>
         </w:rPr>
-        <w:t xml:space="preserve">ESMO_OPEN_COVER_LETTER_RATIONALE_V3_10.docx</w:t>
+        <w:t>ESMO_OPEN_COVER_LETTER_RATIONALE_V3_10.docx</w:t>
       </w:r>
     </w:p>
     <w:p>
@@ -70,7 +70,7 @@
         <w:rPr>
           <w:rStyle w:val="VerbatimChar"/>
         </w:rPr>
-        <w:t xml:space="preserve">ESMO_OPEN_SUPPLEMENTARY_INDEX_CORE_V3_10.docx</w:t>
+        <w:t>ESMO_OPEN_SUPPLEMENTARY_INDEX_CORE_V3_10.docx</w:t>
       </w:r>
     </w:p>
     <w:bookmarkEnd w:id="9"/>
@@ -80,7 +80,7 @@
         <w:pStyle w:val="Heading2"/>
       </w:pPr>
       <w:r>
-        <w:t xml:space="preserve">Core Figures</w:t>
+        <w:t>Core Figures</w:t>
       </w:r>
     </w:p>
     <w:p>
@@ -95,7 +95,7 @@
         <w:rPr>
           <w:rStyle w:val="VerbatimChar"/>
         </w:rPr>
-        <w:t xml:space="preserve">Figure_1_four_system_toxicity_decomposition_v3_10.pdf/png</w:t>
+        <w:t>Figure_1_four_system_toxicity_decomposition_v3_10.pdf/png</w:t>
       </w:r>
     </w:p>
     <w:p>
@@ -110,7 +110,7 @@
         <w:rPr>
           <w:rStyle w:val="VerbatimChar"/>
         </w:rPr>
-        <w:t xml:space="preserve">Figure_2_phenotype_specific_estimates_v3_5.pdf/png</w:t>
+        <w:t>Figure_2_phenotype_specific_estimates_v3_10.pdf/png</w:t>
       </w:r>
     </w:p>
     <w:p>
@@ -125,7 +125,7 @@
         <w:rPr>
           <w:rStyle w:val="VerbatimChar"/>
         </w:rPr>
-        <w:t xml:space="preserve">Figure_3_organ_specific_irae_estimability_v3_5.pdf/png</w:t>
+        <w:t>Figure_3_organ_specific_irae_estimability_v3_10.pdf/png</w:t>
       </w:r>
     </w:p>
     <w:p>
@@ -140,7 +140,7 @@
         <w:rPr>
           <w:rStyle w:val="VerbatimChar"/>
         </w:rPr>
-        <w:t xml:space="preserve">Figure_4_openfda_reporting_signal_heatmap_v3_10.pdf/png</w:t>
+        <w:t>Figure_4_openfda_reporting_signal_heatmap_v3_10.pdf/png</w:t>
       </w:r>
     </w:p>
     <w:p>
@@ -155,7 +155,7 @@
         <w:rPr>
           <w:rStyle w:val="VerbatimChar"/>
         </w:rPr>
-        <w:t xml:space="preserve">Figure_5_patient_level_irAE_support_v3_10.pdf/png</w:t>
+        <w:t>Figure_5_patient_level_irAE_support_v3_10.pdf/png</w:t>
       </w:r>
     </w:p>
     <w:bookmarkEnd w:id="10"/>
@@ -165,7 +165,7 @@
         <w:pStyle w:val="Heading2"/>
       </w:pPr>
       <w:r>
-        <w:t xml:space="preserve">Core Data Tables</w:t>
+        <w:t>Core Data Tables</w:t>
       </w:r>
     </w:p>
     <w:p>
@@ -180,7 +180,7 @@
         <w:rPr>
           <w:rStyle w:val="VerbatimChar"/>
         </w:rPr>
-        <w:t xml:space="preserve">evidence_source_registry_v1_3.csv</w:t>
+        <w:t>evidence_source_registry_v1_3.csv</w:t>
       </w:r>
     </w:p>
     <w:p>
@@ -195,7 +195,7 @@
         <w:rPr>
           <w:rStyle w:val="VerbatimChar"/>
         </w:rPr>
-        <w:t xml:space="preserve">clinical_endpoint_pooled_estimates_v2_0.csv</w:t>
+        <w:t>clinical_endpoint_pooled_estimates_v2_0.csv</w:t>
       </w:r>
     </w:p>
     <w:p>
@@ -210,7 +210,7 @@
         <w:rPr>
           <w:rStyle w:val="VerbatimChar"/>
         </w:rPr>
-        <w:t xml:space="preserve">organ_specific_irae_endpoint_compatibility_audit_v2_1.csv</w:t>
+        <w:t>organ_specific_irae_endpoint_compatibility_audit_v2_1.csv</w:t>
       </w:r>
     </w:p>
     <w:p>
@@ -225,7 +225,7 @@
         <w:rPr>
           <w:rStyle w:val="VerbatimChar"/>
         </w:rPr>
-        <w:t xml:space="preserve">openfda_ici_irae_reporting_signal_v3_7.csv</w:t>
+        <w:t>openfda_ici_irae_reporting_signal_v3_7.csv</w:t>
       </w:r>
     </w:p>
     <w:p>
@@ -240,7 +240,7 @@
         <w:rPr>
           <w:rStyle w:val="VerbatimChar"/>
         </w:rPr>
-        <w:t xml:space="preserve">GSE186144_lozano_irAE_signature_association_v3_5.csv</w:t>
+        <w:t>GSE186144_lozano_irAE_signature_association_v3_5.csv</w:t>
       </w:r>
     </w:p>
     <w:p>
@@ -255,7 +255,12 @@
         <w:rPr>
           <w:rStyle w:val="VerbatimChar"/>
         </w:rPr>
-        <w:t xml:space="preserve">GSE186144_lozano_therapy_adjusted_signature_models_v3_5.csv</w:t>
+        <w:t>GSE186144_lozano_therapy_adjusted_signature_models_v3_5.csv</w:t>
+      </w:r>
+    </w:p>
+    <w:p>
+      <w:r>
+        <w:t xml:space="preserve">supplementary_table_ICI_agents_and_PT_families.csv</w:t>
       </w:r>
     </w:p>
     <w:bookmarkEnd w:id="11"/>
@@ -265,7 +270,7 @@
         <w:pStyle w:val="Heading2"/>
       </w:pPr>
       <w:r>
-        <w:t xml:space="preserve">External Source Notes</w:t>
+        <w:t>External Source Notes</w:t>
       </w:r>
     </w:p>
     <w:p>
@@ -273,7 +278,7 @@
         <w:pStyle w:val="FirstParagraph"/>
       </w:pPr>
       <w:r>
-        <w:t xml:space="preserve">The openFDA analysis used exact matching against the public FDA Drug Event API: https://open.fda.gov/apis/drug/event/</w:t>
+        <w:t>The openFDA analysis used exact matching against the public FDA Drug Event API: https://open.fda.gov/apis/drug/event/</w:t>
       </w:r>
     </w:p>
     <w:p>
@@ -289,7 +294,7 @@
         <w:pStyle w:val="BodyText"/>
       </w:pPr>
       <w:r>
-        <w:t xml:space="preserve">Submission-facing package (v3.10): https://github.com/xutaoguo55/ici-irae-phenotype-decomposition-esmo-open-v3-10/releases/tag/v3.10</w:t>
+        <w:t>Submission-facing package (v3.10): https://github.com/xutaoguo55/ici-irae-phenotype-decomposition-esmo-open-v3-10/releases/tag/v3.10</w:t>
       </w:r>
     </w:p>
     <w:p>
@@ -297,7 +302,7 @@
         <w:pStyle w:val="BodyText"/>
       </w:pPr>
       <w:r>
-        <w:t xml:space="preserve">DOI: 10.5281/zenodo.20989857 (https://doi.org/10.5281/zenodo.20989857).</w:t>
+        <w:t>DOI: 10.5281/zenodo.20989857 (https://doi.org/10.5281/zenodo.20989857).</w:t>
       </w:r>
     </w:p>
     <w:bookmarkEnd w:id="12"/>

</xml_diff>

<commit_message>
Add graphical abstract for ESMO Open submission
Four-panel visual summary: aggregate registry, organ irAE estimability,
openFDA reporting signals, PBMC molecular support.
Central message: phenotype decomposition across non-exchangeable systems.
14×7 inches, 350 dpi, PDF+PNG.

Co-Authored-By: Claude <noreply@anthropic.com>
</commit_message>
<xml_diff>
--- a/UPLOAD_THIS_ESMO_OPEN_V3_10_HARDENED_UNDER20/ESMO_OPEN_SUPPLEMENTARY_INDEX_CORE_V3_10.docx
+++ b/UPLOAD_THIS_ESMO_OPEN_V3_10_HARDENED_UNDER20/ESMO_OPEN_SUPPLEMENTARY_INDEX_CORE_V3_10.docx
@@ -71,6 +71,11 @@
           <w:rStyle w:val="VerbatimChar"/>
         </w:rPr>
         <w:t>ESMO_OPEN_SUPPLEMENTARY_INDEX_CORE_V3_10.docx</w:t>
+      </w:r>
+    </w:p>
+    <w:p>
+      <w:r>
+        <w:t xml:space="preserve">Graphical_Abstract_v3_10.pdf/png</w:t>
       </w:r>
     </w:p>
     <w:bookmarkEnd w:id="9"/>

</xml_diff>